<commit_message>
new version Thu Jan 22 13:24:28 EST 2026
</commit_message>
<xml_diff>
--- a/education_research/Informed_Consent_Document.docx
+++ b/education_research/Informed_Consent_Document.docx
@@ -91,21 +91,12 @@
           <w:bCs/>
         </w:rPr>
       </w:pPr>
-      <w:proofErr w:type="spellStart"/>
-      <w:r>
-        <w:rPr>
-          <w:b/>
-          <w:bCs/>
-        </w:rPr>
-        <w:t>EducateAI</w:t>
-      </w:r>
-      <w:proofErr w:type="spellEnd"/>
-      <w:r>
-        <w:rPr>
-          <w:b/>
-          <w:bCs/>
-        </w:rPr>
-        <w:t>: Educating Responsible Technologists: Integrating Artificial Intelligence and Social Sciences via Immersive Learning Modules</w:t>
+      <w:r>
+        <w:rPr>
+          <w:b/>
+          <w:bCs/>
+        </w:rPr>
+        <w:t>EducateAI: Educating Responsible Technologists: Integrating Artificial Intelligence and Social Sciences via Immersive Learning Modules</w:t>
       </w:r>
     </w:p>
     <w:p>
@@ -115,7 +106,19 @@
     </w:p>
     <w:p>
       <w:r>
-        <w:t>This study is being conducted and overseen by Paul Ruvolo, a Professor at Olin College of Engineering.</w:t>
+        <w:t>This study is being conducted and overseen by Paul Ruvolo</w:t>
+      </w:r>
+      <w:r>
+        <w:t xml:space="preserve"> (Olin College Professor)</w:t>
+      </w:r>
+      <w:r>
+        <w:t>, Caitrin Lynch (Olin College Professor)</w:t>
+      </w:r>
+      <w:r>
+        <w:t>,</w:t>
+      </w:r>
+      <w:r>
+        <w:t xml:space="preserve"> and Chelsea Andrews (Tufts Professor)</w:t>
       </w:r>
     </w:p>
     <w:p/>
@@ -129,11 +132,9 @@
       <w:r>
         <w:t xml:space="preserve">If you decide to participate in this </w:t>
       </w:r>
-      <w:proofErr w:type="gramStart"/>
-      <w:r>
-        <w:t>study</w:t>
-      </w:r>
-      <w:proofErr w:type="gramEnd"/>
+      <w:r>
+        <w:t>study,</w:t>
+      </w:r>
       <w:r>
         <w:t xml:space="preserve"> you will sign this form – make sure you understand it completely before signing. Keep a copy of this form for your records – it has important information like whom to contact if you have questions later.  </w:t>
       </w:r>
@@ -156,7 +157,13 @@
     </w:p>
     <w:p>
       <w:r>
-        <w:t>How does experience with a project in applying AI to create technologies for and in collaboration with (people who are blind | older adults) lead to changes in student orientation towards their engineering identity and approach.</w:t>
+        <w:t>How does experience with a project in applying AI to create technologies for and in collaboration with (people who are blin</w:t>
+      </w:r>
+      <w:r>
+        <w:t>d</w:t>
+      </w:r>
+      <w:r>
+        <w:t>) lead to changes in student orientation towards their engineering identity and approach.</w:t>
       </w:r>
     </w:p>
     <w:p/>
@@ -177,7 +184,13 @@
     </w:p>
     <w:p>
       <w:r>
-        <w:t>Anyone is enrolled in the course Machine Learning.</w:t>
+        <w:t xml:space="preserve">Anyone </w:t>
+      </w:r>
+      <w:r>
+        <w:t xml:space="preserve">who </w:t>
+      </w:r>
+      <w:r>
+        <w:t>is enrolled in the course Machine Learning.</w:t>
       </w:r>
     </w:p>
     <w:p/>
@@ -198,13 +211,8 @@
     </w:p>
     <w:p>
       <w:r>
-        <w:t xml:space="preserve">There are three components to this study </w:t>
-      </w:r>
-      <w:proofErr w:type="gramStart"/>
-      <w:r>
-        <w:t>– :</w:t>
-      </w:r>
-      <w:proofErr w:type="gramEnd"/>
+        <w:t>There are three components to this study:</w:t>
+      </w:r>
     </w:p>
     <w:p/>
     <w:p>
@@ -222,13 +230,11 @@
         </w:pBdr>
       </w:pPr>
       <w:r>
-        <w:t xml:space="preserve">As part of the first </w:t>
-      </w:r>
-      <w:proofErr w:type="gramStart"/>
-      <w:r>
-        <w:t>assignment</w:t>
-      </w:r>
-      <w:proofErr w:type="gramEnd"/>
+        <w:t>As part of the first assignment</w:t>
+      </w:r>
+      <w:r>
+        <w:t>,</w:t>
+      </w:r>
       <w:r>
         <w:t xml:space="preserve"> you will be filling out a series of surveys.  These surveys</w:t>
       </w:r>
@@ -239,13 +245,13 @@
         <w:t xml:space="preserve"> will take you about </w:t>
       </w:r>
       <w:r>
-        <w:t>2</w:t>
+        <w:t>30</w:t>
       </w:r>
       <w:r>
         <w:rPr>
           <w:color w:val="000000"/>
         </w:rPr>
-        <w:t>0 minutes</w:t>
+        <w:t xml:space="preserve"> minutes</w:t>
       </w:r>
       <w:r>
         <w:t xml:space="preserve"> to complete.</w:t>
@@ -275,7 +281,13 @@
         <w:t xml:space="preserve">, you will be filling </w:t>
       </w:r>
       <w:r>
-        <w:t>out some additional surveys, which will take you about 20 minutes to complete</w:t>
+        <w:t xml:space="preserve">out some additional surveys, which will take you about </w:t>
+      </w:r>
+      <w:r>
+        <w:t>30</w:t>
+      </w:r>
+      <w:r>
+        <w:t xml:space="preserve"> minutes to complete</w:t>
       </w:r>
       <w:r>
         <w:rPr>
@@ -366,15 +378,10 @@
     </w:p>
     <w:p>
       <w:r>
-        <w:t xml:space="preserve">No – you will not. But we hope to learn more about the educational effects of experiences </w:t>
-      </w:r>
-      <w:proofErr w:type="gramStart"/>
-      <w:r>
-        <w:t>similar to</w:t>
-      </w:r>
-      <w:proofErr w:type="gramEnd"/>
-      <w:r>
-        <w:t xml:space="preserve"> the one you are doing this summer.</w:t>
+        <w:t>No – you will not. But we hope to learn more about the educational effects o</w:t>
+      </w:r>
+      <w:r>
+        <w:t>f the Olin curriculum, which may be used at other institutions or with future Olin courses.</w:t>
       </w:r>
     </w:p>
     <w:p/>
@@ -416,15 +423,7 @@
     </w:p>
     <w:p>
       <w:r>
-        <w:t xml:space="preserve">We will not share any information that we collect that can identify you unless we legally </w:t>
-      </w:r>
-      <w:proofErr w:type="gramStart"/>
-      <w:r>
-        <w:t>have to</w:t>
-      </w:r>
-      <w:proofErr w:type="gramEnd"/>
-      <w:r>
-        <w:t>.</w:t>
+        <w:t>We will not share any information that we collect that can identify you unless we legally have to.</w:t>
       </w:r>
     </w:p>
     <w:p/>
@@ -436,7 +435,25 @@
     <w:p/>
     <w:p>
       <w:r>
-        <w:t xml:space="preserve">If you participate in an interview, a recording of your interview will be copied into print and erased. Any information that could directly identify you will be deleted. Your answers will be stored in a database protected by a password.  </w:t>
+        <w:t xml:space="preserve">If you participate in an interview, a recording of your interview will be </w:t>
+      </w:r>
+      <w:r>
+        <w:t>transcribed</w:t>
+      </w:r>
+      <w:r>
+        <w:t xml:space="preserve"> into print and </w:t>
+      </w:r>
+      <w:r>
+        <w:t xml:space="preserve">the </w:t>
+      </w:r>
+      <w:r>
+        <w:t>audio</w:t>
+      </w:r>
+      <w:r>
+        <w:t xml:space="preserve"> will be </w:t>
+      </w:r>
+      <w:r>
+        <w:t xml:space="preserve">erased. Any information that could directly identify you will be deleted. Your answers will be stored in a database protected by a password.  </w:t>
       </w:r>
     </w:p>
     <w:p/>
@@ -527,15 +544,7 @@
         </w:r>
       </w:hyperlink>
       <w:r>
-        <w:t xml:space="preserve"> (</w:t>
-      </w:r>
-      <w:proofErr w:type="spellStart"/>
-      <w:r>
-        <w:t>tel</w:t>
-      </w:r>
-      <w:proofErr w:type="spellEnd"/>
-      <w:r>
-        <w:t>: 650-279-8868)</w:t>
+        <w:t xml:space="preserve"> (tel: 650-279-8868)</w:t>
       </w:r>
       <w:r>
         <w:t xml:space="preserve"> or Dr. Lynch at </w:t>
@@ -558,15 +567,7 @@
     <w:p/>
     <w:p>
       <w:r>
-        <w:t xml:space="preserve">This research was approved by an office/committee that oversees the ethics of human </w:t>
-      </w:r>
-      <w:proofErr w:type="gramStart"/>
-      <w:r>
-        <w:t>subjects</w:t>
-      </w:r>
-      <w:proofErr w:type="gramEnd"/>
-      <w:r>
-        <w:t xml:space="preserve"> research at Brandeis University. If you have any questions about your rights – or if you have concerns about the study – you may contact them at 781-736-8133 or </w:t>
+        <w:t xml:space="preserve">This research was approved by an office/committee that oversees the ethics of human subjects research at Brandeis University. If you have any questions about your rights – or if you have concerns about the study – you may contact them at 781-736-8133 or </w:t>
       </w:r>
     </w:p>
     <w:p>
@@ -575,18 +576,6 @@
       </w:r>
     </w:p>
     <w:p/>
-    <w:p>
-      <w:pPr>
-        <w:rPr>
-          <w:b/>
-          <w:bCs/>
-        </w:rPr>
-      </w:pPr>
-      <w:r>
-        <w:lastRenderedPageBreak/>
-        <w:br w:type="page"/>
-      </w:r>
-    </w:p>
     <w:p>
       <w:pPr>
         <w:rPr>
@@ -607,11 +596,9 @@
       <w:r>
         <w:t xml:space="preserve">I have read this consent form completely. I have been encouraged to ask </w:t>
       </w:r>
-      <w:proofErr w:type="gramStart"/>
-      <w:r>
-        <w:t>questions, and</w:t>
-      </w:r>
-      <w:proofErr w:type="gramEnd"/>
+      <w:r>
+        <w:t>questions and</w:t>
+      </w:r>
       <w:r>
         <w:t xml:space="preserve"> have received helpful answers. I understand that:</w:t>
       </w:r>
@@ -689,13 +676,11 @@
         <w:t xml:space="preserve">I am </w:t>
       </w:r>
       <w:r>
-        <w:t xml:space="preserve">willing to participate in the </w:t>
-      </w:r>
-      <w:proofErr w:type="gramStart"/>
-      <w:r>
-        <w:t>study</w:t>
-      </w:r>
-      <w:proofErr w:type="gramEnd"/>
+        <w:t>willing to participate in the study</w:t>
+      </w:r>
+      <w:r>
+        <w:t>,</w:t>
+      </w:r>
       <w:r>
         <w:t xml:space="preserve"> and I am open to doing an interview </w:t>
       </w:r>

</xml_diff>